<commit_message>
Add a download-link check and put it in the project instructions
tools/check_download_links.py lists every GitHub link in the decks, emails,
workbook, and quick-reference card. It fails if a linked file is missing
locally or on origin/main, and warns when main has an older copy. --online
opens each link without signing in. The project summary (test instructions,
known issues), tools/README, and the readiness checklist now say to run it,
or to open the links in an InPrivate window, before sending the emails.

Co-Authored-By: Claude Opus 5.5 <noreply@anthropic.com>
</commit_message>
<xml_diff>
--- a/instructor/readiness-checklist.docx
+++ b/instructor/readiness-checklist.docx
@@ -10,7 +10,7 @@
           <w:sz w:val="21"/>
           <w:szCs w:val="24"/>
         </w:rPr>
-        <w:id w:val="428479526"/>
+        <w:id w:val="-942990603"/>
         <w:docPartObj>
           <w:docPartGallery w:val="Table of Contents"/>
           <w:docPartUnique/>
@@ -51,7 +51,7 @@
           <w:r>
             <w:fldChar w:fldCharType="separate"/>
           </w:r>
-          <w:hyperlink w:anchor="_Toc242253837" w:history="1">
+          <w:hyperlink w:anchor="_Toc242262367" w:history="1">
             <w:r>
               <w:rPr>
                 <w:rStyle w:val="Hyperlink"/>
@@ -78,7 +78,7 @@
                 <w:noProof/>
                 <w:webHidden/>
               </w:rPr>
-              <w:instrText xml:space="preserve"> PAGEREF _Toc242253837 \h </w:instrText>
+              <w:instrText xml:space="preserve"> PAGEREF _Toc242262367 \h </w:instrText>
             </w:r>
             <w:r>
               <w:rPr>
@@ -125,7 +125,7 @@
               <w14:ligatures w14:val="standardContextual"/>
             </w:rPr>
           </w:pPr>
-          <w:hyperlink w:anchor="_Toc242253838" w:history="1">
+          <w:hyperlink w:anchor="_Toc242262368" w:history="1">
             <w:r>
               <w:rPr>
                 <w:rStyle w:val="Hyperlink"/>
@@ -152,7 +152,7 @@
                 <w:noProof/>
                 <w:webHidden/>
               </w:rPr>
-              <w:instrText xml:space="preserve"> PAGEREF _Toc242253838 \h </w:instrText>
+              <w:instrText xml:space="preserve"> PAGEREF _Toc242262368 \h </w:instrText>
             </w:r>
             <w:r>
               <w:rPr>
@@ -199,7 +199,7 @@
               <w14:ligatures w14:val="standardContextual"/>
             </w:rPr>
           </w:pPr>
-          <w:hyperlink w:anchor="_Toc242253839" w:history="1">
+          <w:hyperlink w:anchor="_Toc242262369" w:history="1">
             <w:r>
               <w:rPr>
                 <w:rStyle w:val="Hyperlink"/>
@@ -226,7 +226,7 @@
                 <w:noProof/>
                 <w:webHidden/>
               </w:rPr>
-              <w:instrText xml:space="preserve"> PAGEREF _Toc242253839 \h </w:instrText>
+              <w:instrText xml:space="preserve"> PAGEREF _Toc242262369 \h </w:instrText>
             </w:r>
             <w:r>
               <w:rPr>
@@ -273,7 +273,7 @@
               <w14:ligatures w14:val="standardContextual"/>
             </w:rPr>
           </w:pPr>
-          <w:hyperlink w:anchor="_Toc242253840" w:history="1">
+          <w:hyperlink w:anchor="_Toc242262370" w:history="1">
             <w:r>
               <w:rPr>
                 <w:rStyle w:val="Hyperlink"/>
@@ -300,7 +300,7 @@
                 <w:noProof/>
                 <w:webHidden/>
               </w:rPr>
-              <w:instrText xml:space="preserve"> PAGEREF _Toc242253840 \h </w:instrText>
+              <w:instrText xml:space="preserve"> PAGEREF _Toc242262370 \h </w:instrText>
             </w:r>
             <w:r>
               <w:rPr>
@@ -347,7 +347,7 @@
               <w14:ligatures w14:val="standardContextual"/>
             </w:rPr>
           </w:pPr>
-          <w:hyperlink w:anchor="_Toc242253841" w:history="1">
+          <w:hyperlink w:anchor="_Toc242262371" w:history="1">
             <w:r>
               <w:rPr>
                 <w:rStyle w:val="Hyperlink"/>
@@ -374,7 +374,7 @@
                 <w:noProof/>
                 <w:webHidden/>
               </w:rPr>
-              <w:instrText xml:space="preserve"> PAGEREF _Toc242253841 \h </w:instrText>
+              <w:instrText xml:space="preserve"> PAGEREF _Toc242262371 \h </w:instrText>
             </w:r>
             <w:r>
               <w:rPr>
@@ -421,7 +421,7 @@
               <w14:ligatures w14:val="standardContextual"/>
             </w:rPr>
           </w:pPr>
-          <w:hyperlink w:anchor="_Toc242253842" w:history="1">
+          <w:hyperlink w:anchor="_Toc242262372" w:history="1">
             <w:r>
               <w:rPr>
                 <w:rStyle w:val="Hyperlink"/>
@@ -448,7 +448,7 @@
                 <w:noProof/>
                 <w:webHidden/>
               </w:rPr>
-              <w:instrText xml:space="preserve"> PAGEREF _Toc242253842 \h </w:instrText>
+              <w:instrText xml:space="preserve"> PAGEREF _Toc242262372 \h </w:instrText>
             </w:r>
             <w:r>
               <w:rPr>
@@ -495,7 +495,7 @@
               <w14:ligatures w14:val="standardContextual"/>
             </w:rPr>
           </w:pPr>
-          <w:hyperlink w:anchor="_Toc242253843" w:history="1">
+          <w:hyperlink w:anchor="_Toc242262373" w:history="1">
             <w:r>
               <w:rPr>
                 <w:rStyle w:val="Hyperlink"/>
@@ -522,7 +522,7 @@
                 <w:noProof/>
                 <w:webHidden/>
               </w:rPr>
-              <w:instrText xml:space="preserve"> PAGEREF _Toc242253843 \h </w:instrText>
+              <w:instrText xml:space="preserve"> PAGEREF _Toc242262373 \h </w:instrText>
             </w:r>
             <w:r>
               <w:rPr>
@@ -569,7 +569,7 @@
               <w14:ligatures w14:val="standardContextual"/>
             </w:rPr>
           </w:pPr>
-          <w:hyperlink w:anchor="_Toc242253844" w:history="1">
+          <w:hyperlink w:anchor="_Toc242262374" w:history="1">
             <w:r>
               <w:rPr>
                 <w:rStyle w:val="Hyperlink"/>
@@ -596,7 +596,7 @@
                 <w:noProof/>
                 <w:webHidden/>
               </w:rPr>
-              <w:instrText xml:space="preserve"> PAGEREF _Toc242253844 \h </w:instrText>
+              <w:instrText xml:space="preserve"> PAGEREF _Toc242262374 \h </w:instrText>
             </w:r>
             <w:r>
               <w:rPr>
@@ -643,7 +643,7 @@
               <w14:ligatures w14:val="standardContextual"/>
             </w:rPr>
           </w:pPr>
-          <w:hyperlink w:anchor="_Toc242253845" w:history="1">
+          <w:hyperlink w:anchor="_Toc242262375" w:history="1">
             <w:r>
               <w:rPr>
                 <w:rStyle w:val="Hyperlink"/>
@@ -670,7 +670,7 @@
                 <w:noProof/>
                 <w:webHidden/>
               </w:rPr>
-              <w:instrText xml:space="preserve"> PAGEREF _Toc242253845 \h </w:instrText>
+              <w:instrText xml:space="preserve"> PAGEREF _Toc242262375 \h </w:instrText>
             </w:r>
             <w:r>
               <w:rPr>
@@ -713,7 +713,7 @@
         <w:pStyle w:val="Heading1"/>
       </w:pPr>
       <w:bookmarkStart w:id="0" w:name="pre-workshop-readiness-checklist"/>
-      <w:bookmarkStart w:id="1" w:name="_Toc242253837"/>
+      <w:bookmarkStart w:id="1" w:name="_Toc242262367"/>
       <w:r>
         <w:t>Pre-Workshop Readiness Checklist</w:t>
       </w:r>
@@ -801,7 +801,7 @@
         <w:pStyle w:val="Heading2"/>
       </w:pPr>
       <w:bookmarkStart w:id="2" w:name="preparation-timeline"/>
-      <w:bookmarkStart w:id="3" w:name="_Toc242253838"/>
+      <w:bookmarkStart w:id="3" w:name="_Toc242262368"/>
       <w:r>
         <w:t>Preparation timeline</w:t>
       </w:r>
@@ -828,9 +828,9 @@
         <w:tblLook w:val="0020" w:firstRow="1" w:lastRow="0" w:firstColumn="0" w:lastColumn="0" w:noHBand="0" w:noVBand="0"/>
       </w:tblPr>
       <w:tblGrid>
-        <w:gridCol w:w="951"/>
-        <w:gridCol w:w="1261"/>
-        <w:gridCol w:w="7760"/>
+        <w:gridCol w:w="908"/>
+        <w:gridCol w:w="1210"/>
+        <w:gridCol w:w="7854"/>
       </w:tblGrid>
       <w:tr>
         <w:trPr>
@@ -1271,7 +1271,33 @@
               <w:rPr>
                 <w:sz w:val="19"/>
               </w:rPr>
-              <w:t xml:space="preserve"> is ready to paste into Outlook.</w:t>
+              <w:t xml:space="preserve"> is ready to paste into Outlook. </w:t>
+            </w:r>
+            <w:r>
+              <w:rPr>
+                <w:b/>
+                <w:bCs/>
+                <w:sz w:val="19"/>
+              </w:rPr>
+              <w:t>Before you send either email, check its download links:</w:t>
+            </w:r>
+            <w:r>
+              <w:rPr>
+                <w:sz w:val="19"/>
+              </w:rPr>
+              <w:t xml:space="preserve"> open each one in an InPrivate window. It must download the file without a GitHub sign-in. If you get a sign-in page (the kit repo is private), replace the link with your Teams/SharePoint copy. Maintainers can run </w:t>
+            </w:r>
+            <w:r>
+              <w:rPr>
+                <w:rStyle w:val="VerbatimChar"/>
+              </w:rPr>
+              <w:t>tools/check_download_links.py --online</w:t>
+            </w:r>
+            <w:r>
+              <w:rPr>
+                <w:sz w:val="19"/>
+              </w:rPr>
+              <w:t xml:space="preserve"> to check every link in the decks and emails at once.</w:t>
             </w:r>
           </w:p>
         </w:tc>
@@ -1292,7 +1318,16 @@
                 <w:bCs/>
                 <w:sz w:val="19"/>
               </w:rPr>
-              <w:t>T − 1 to 2 days</w:t>
+              <w:t xml:space="preserve">T − 1 to </w:t>
+            </w:r>
+            <w:r>
+              <w:rPr>
+                <w:b/>
+                <w:bCs/>
+                <w:sz w:val="19"/>
+              </w:rPr>
+              <w:lastRenderedPageBreak/>
+              <w:t>2 days</w:t>
             </w:r>
           </w:p>
         </w:tc>
@@ -1309,6 +1344,7 @@
               <w:rPr>
                 <w:sz w:val="19"/>
               </w:rPr>
+              <w:lastRenderedPageBreak/>
               <w:t>Facilitator</w:t>
             </w:r>
           </w:p>
@@ -1354,7 +1390,14 @@
               <w:rPr>
                 <w:sz w:val="19"/>
               </w:rPr>
-              <w:t xml:space="preserve"> with VS Code and the Work IQ MCP server (</w:t>
+              <w:t xml:space="preserve"> with VS </w:t>
+            </w:r>
+            <w:r>
+              <w:rPr>
+                <w:sz w:val="19"/>
+              </w:rPr>
+              <w:lastRenderedPageBreak/>
+              <w:t>Code and the Work IQ MCP server (</w:t>
             </w:r>
             <w:hyperlink r:id="rId11">
               <w:r>
@@ -1403,16 +1446,8 @@
                 <w:bCs/>
                 <w:sz w:val="19"/>
               </w:rPr>
-              <w:t xml:space="preserve">T − 1 </w:t>
-            </w:r>
-            <w:r>
-              <w:rPr>
-                <w:b/>
-                <w:bCs/>
-                <w:sz w:val="19"/>
-              </w:rPr>
               <w:lastRenderedPageBreak/>
-              <w:t>day</w:t>
+              <w:t>T − 1 day</w:t>
             </w:r>
           </w:p>
         </w:tc>
@@ -1429,15 +1464,7 @@
               <w:rPr>
                 <w:sz w:val="19"/>
               </w:rPr>
-              <w:lastRenderedPageBreak/>
-              <w:t xml:space="preserve">Host / </w:t>
-            </w:r>
-            <w:r>
-              <w:rPr>
-                <w:sz w:val="19"/>
-              </w:rPr>
-              <w:lastRenderedPageBreak/>
-              <w:t>admin</w:t>
+              <w:t>Host / admin</w:t>
             </w:r>
           </w:p>
         </w:tc>
@@ -1454,7 +1481,6 @@
               <w:rPr>
                 <w:sz w:val="19"/>
               </w:rPr>
-              <w:lastRenderedPageBreak/>
               <w:t xml:space="preserve">With a spare or test account in the attendees' tenant, run the smoke test </w:t>
             </w:r>
             <w:r>
@@ -1469,14 +1495,7 @@
               <w:rPr>
                 <w:sz w:val="19"/>
               </w:rPr>
-              <w:t xml:space="preserve"> the Exercise </w:t>
-            </w:r>
-            <w:r>
-              <w:rPr>
-                <w:sz w:val="19"/>
-              </w:rPr>
-              <w:lastRenderedPageBreak/>
-              <w:t xml:space="preserve">3 browser prompt in an </w:t>
+              <w:t xml:space="preserve"> the Exercise 3 browser prompt in an </w:t>
             </w:r>
             <w:r>
               <w:rPr>
@@ -1490,13 +1509,7 @@
               <w:rPr>
                 <w:sz w:val="19"/>
               </w:rPr>
-              <w:t xml:space="preserve"> </w:t>
-            </w:r>
-            <w:r>
-              <w:rPr>
-                <w:sz w:val="19"/>
-              </w:rPr>
-              <w:t xml:space="preserve">profile (accept the consent notice). Print the </w:t>
+              <w:t xml:space="preserve"> profile (accept the consent notice). Print the </w:t>
             </w:r>
             <w:hyperlink r:id="rId12">
               <w:r>
@@ -1531,7 +1544,6 @@
                 <w:bCs/>
                 <w:sz w:val="19"/>
               </w:rPr>
-              <w:lastRenderedPageBreak/>
               <w:t>Day of, T − 45 min</w:t>
             </w:r>
           </w:p>
@@ -1668,7 +1680,7 @@
         <w:pStyle w:val="Heading2"/>
       </w:pPr>
       <w:bookmarkStart w:id="4" w:name="cost-planning"/>
-      <w:bookmarkStart w:id="5" w:name="_Toc242253839"/>
+      <w:bookmarkStart w:id="5" w:name="_Toc242262369"/>
       <w:bookmarkEnd w:id="2"/>
       <w:r>
         <w:t>Cost planning</w:t>
@@ -1758,7 +1770,10 @@
         </w:r>
       </w:hyperlink>
       <w:r>
-        <w:t>). Estimate for ~25 users × 8 exercises, plus spares, the facilitator's dry run, and the Exercise 1 and 7 schedules that keep running until paused.</w:t>
+        <w:t xml:space="preserve">). </w:t>
+      </w:r>
+      <w:r>
+        <w:t>Estimate for ~25 users × 8 exercises, plus spares, the facilitator's dry run, and the Exercise 1 and 7 schedules that keep running until paused.</w:t>
       </w:r>
     </w:p>
     <w:p>
@@ -1787,10 +1802,7 @@
         <w:t>pause every schedule the day after</w:t>
       </w:r>
       <w:r>
-        <w:t xml:space="preserve">. A low limit doesn't block access: people can work until they </w:t>
-      </w:r>
-      <w:r>
-        <w:t>reach it. To remove someone's access, take them out of the policy's scope instead.</w:t>
+        <w:t>. A low limit doesn't block access: people can work until they reach it. To remove someone's access, take them out of the policy's scope instead.</w:t>
       </w:r>
     </w:p>
     <w:p>
@@ -1809,7 +1821,10 @@
         <w:t>After the event:</w:t>
       </w:r>
       <w:r>
-        <w:t xml:space="preserve"> remove the workshop group from the spending policy (or delete the policy) if the accounts shouldn't keep Cowork access.</w:t>
+        <w:t xml:space="preserve"> </w:t>
+      </w:r>
+      <w:r>
+        <w:t>remove the workshop group from the spending policy (or delete the policy) if the accounts shouldn't keep Cowork access.</w:t>
       </w:r>
     </w:p>
     <w:p>
@@ -1846,7 +1861,7 @@
         <w:pStyle w:val="Heading2"/>
       </w:pPr>
       <w:bookmarkStart w:id="6" w:name="X26afd18925ecd972192f69d7821188544492b05"/>
-      <w:bookmarkStart w:id="7" w:name="_Toc242253840"/>
+      <w:bookmarkStart w:id="7" w:name="_Toc242262370"/>
       <w:bookmarkEnd w:id="4"/>
       <w:r>
         <w:t>Plan B — if Cowork is down for the whole room</w:t>
@@ -1967,7 +1982,10 @@
         <w:t>Reschedule a 90-minute hands-on follow-up</w:t>
       </w:r>
       <w:r>
-        <w:t xml:space="preserve"> for Exercises 1, 3, 4, and 7, with the same accounts and sample files.</w:t>
+        <w:t xml:space="preserve"> for Exercises 1, 3, 4, and 7, with the same </w:t>
+      </w:r>
+      <w:r>
+        <w:t>accounts and sample files.</w:t>
       </w:r>
     </w:p>
     <w:p>
@@ -1975,7 +1993,7 @@
         <w:pStyle w:val="Heading2"/>
       </w:pPr>
       <w:bookmarkStart w:id="8" w:name="Xb75ebb7955b3d09d1e310be1bac89915d98d77c"/>
-      <w:bookmarkStart w:id="9" w:name="_Toc242253841"/>
+      <w:bookmarkStart w:id="9" w:name="_Toc242262371"/>
       <w:bookmarkEnd w:id="6"/>
       <w:r>
         <w:t>For the host / tenant admin (do this before the workshop)</w:t>
@@ -2033,6 +2051,7 @@
         </w:numPr>
       </w:pPr>
       <w:r>
+        <w:lastRenderedPageBreak/>
         <w:t xml:space="preserve">Put the attendees (and spares) in a </w:t>
       </w:r>
       <w:r>
@@ -2082,10 +2101,7 @@
         <w:t>spending policy that selects Cowork</w:t>
       </w:r>
       <w:r>
-        <w:t xml:space="preserve"> </w:t>
-      </w:r>
-      <w:r>
-        <w:t xml:space="preserve">and is scoped to that group. The spending policy is what </w:t>
+        <w:t xml:space="preserve"> and is scoped to that group. The spending policy is what </w:t>
       </w:r>
       <w:r>
         <w:rPr>
@@ -2132,7 +2148,6 @@
           <w:b/>
           <w:bCs/>
         </w:rPr>
-        <w:lastRenderedPageBreak/>
         <w:t>Cowork Browsing</w:t>
       </w:r>
       <w:r>
@@ -2186,7 +2201,10 @@
         <w:t>CopilotCoworkToolActionsEnabled</w:t>
       </w:r>
       <w:r>
-        <w:t xml:space="preserve"> isn't set to Disabled on managed laptops. Details: </w:t>
+        <w:t xml:space="preserve"> isn't set to </w:t>
+      </w:r>
+      <w:r>
+        <w:t xml:space="preserve">Disabled on managed laptops. Details: </w:t>
       </w:r>
       <w:hyperlink r:id="rId20">
         <w:r>
@@ -2271,20 +2289,20 @@
         <w:t>facilitator's own (demo) tenant</w:t>
       </w:r>
       <w:r>
+        <w:t xml:space="preserve"> is Copilot- and Cowork-ready for live demos, and that </w:t>
+      </w:r>
+      <w:r>
+        <w:rPr>
+          <w:b/>
+          <w:bCs/>
+        </w:rPr>
+        <w:t>Work IQ MCP write operations</w:t>
+      </w:r>
+      <w:r>
         <w:t xml:space="preserve"> </w:t>
       </w:r>
       <w:r>
-        <w:t xml:space="preserve">is Copilot- and Cowork-ready for live demos, and that </w:t>
-      </w:r>
-      <w:r>
-        <w:rPr>
-          <w:b/>
-          <w:bCs/>
-        </w:rPr>
-        <w:t>Work IQ MCP write operations</w:t>
-      </w:r>
-      <w:r>
-        <w:t xml:space="preserve"> are allowed there so the facilitator can load the seed (</w:t>
+        <w:t>are allowed there so the facilitator can load the seed (</w:t>
       </w:r>
       <w:hyperlink r:id="rId21">
         <w:r>
@@ -2362,7 +2380,10 @@
         <w:t>SharePoint library</w:t>
       </w:r>
       <w:r>
-        <w:t xml:space="preserve">), so attendees can copy them into their own OneDrive. Getting the files from GitHub? If a link opens the file on GitHub, select the </w:t>
+        <w:t xml:space="preserve">), so attendees can copy them into their own OneDrive. Getting the files from GitHub? </w:t>
+      </w:r>
+      <w:r>
+        <w:t xml:space="preserve">If a link opens the file on GitHub, select the </w:t>
       </w:r>
       <w:r>
         <w:rPr>
@@ -2441,7 +2462,10 @@
         <w:t>After class:</w:t>
       </w:r>
       <w:r>
-        <w:t xml:space="preserve"> remind attendees (or clean up centrally) to </w:t>
+        <w:t xml:space="preserve"> </w:t>
+      </w:r>
+      <w:r>
+        <w:t xml:space="preserve">remind attendees (or clean up centrally) to </w:t>
       </w:r>
       <w:r>
         <w:rPr>
@@ -2524,7 +2548,7 @@
           <w:noProof/>
         </w:rPr>
         <w:drawing>
-          <wp:inline distT="0" distB="0" distL="0" distR="0" wp14:anchorId="3CA8E40B" wp14:editId="36414CB8">
+          <wp:inline distT="0" distB="0" distL="0" distR="0" wp14:anchorId="5B6E2A8A" wp14:editId="2C62E2D9">
             <wp:extent cx="4400120" cy="1306285"/>
             <wp:effectExtent l="0" t="0" r="0" b="0"/>
             <wp:docPr id="24" name="Picture" descr="Tip: on a GitHub file page, select the Download icon (Download raw file) at the top right of the file"/>
@@ -2571,7 +2595,7 @@
         <w:pStyle w:val="Heading2"/>
       </w:pPr>
       <w:bookmarkStart w:id="10" w:name="X9e7f43dc51ce66ccd050059b76bb488050dc40c"/>
-      <w:bookmarkStart w:id="11" w:name="_Toc242253842"/>
+      <w:bookmarkStart w:id="11" w:name="_Toc242262372"/>
       <w:bookmarkEnd w:id="8"/>
       <w:r>
         <w:t>For attendees (during setup, first 20 minutes)</w:t>
@@ -2716,10 +2740,7 @@
         <w:t>Documents/ai_hr_cowork_workshop</w:t>
       </w:r>
       <w:r>
-        <w:t xml:space="preserve"> </w:t>
-      </w:r>
-      <w:r>
-        <w:t>(I created it in OneDrive → My files → Documents).</w:t>
+        <w:t xml:space="preserve"> (I created it in OneDrive → My files → Documents).</w:t>
       </w:r>
     </w:p>
     <w:p>
@@ -2731,6 +2752,7 @@
         </w:numPr>
       </w:pPr>
       <w:r>
+        <w:lastRenderedPageBreak/>
         <w:t xml:space="preserve">I set my </w:t>
       </w:r>
       <w:r>
@@ -2781,10 +2803,9 @@
         <w:pStyle w:val="Heading2"/>
       </w:pPr>
       <w:bookmarkStart w:id="12" w:name="data-and-shared-tenant-etiquette"/>
-      <w:bookmarkStart w:id="13" w:name="_Toc242253843"/>
+      <w:bookmarkStart w:id="13" w:name="_Toc242262373"/>
       <w:bookmarkEnd w:id="10"/>
       <w:r>
-        <w:lastRenderedPageBreak/>
         <w:t>Data and shared-tenant etiquette</w:t>
       </w:r>
       <w:bookmarkEnd w:id="13"/>
@@ -2834,7 +2855,10 @@
         <w:t>Every other exercise uses the fictional Zava sample files.</w:t>
       </w:r>
       <w:r>
-        <w:t xml:space="preserve"> Don't add real employee records or personal data to the exercise files, prompts, or skills.</w:t>
+        <w:t xml:space="preserve"> Don't add real employee records or </w:t>
+      </w:r>
+      <w:r>
+        <w:t>personal data to the exercise files, prompts, or skills.</w:t>
       </w:r>
     </w:p>
     <w:p>
@@ -2903,7 +2927,7 @@
         <w:pStyle w:val="Heading2"/>
       </w:pPr>
       <w:bookmarkStart w:id="14" w:name="if-something-isnt-ready"/>
-      <w:bookmarkStart w:id="15" w:name="_Toc242253844"/>
+      <w:bookmarkStart w:id="15" w:name="_Toc242262374"/>
       <w:bookmarkEnd w:id="12"/>
       <w:r>
         <w:t>If something isn't ready</w:t>
@@ -2936,10 +2960,10 @@
         <w:t>spare account</w:t>
       </w:r>
       <w:r>
-        <w:t xml:space="preserve"> </w:t>
-      </w:r>
-      <w:r>
-        <w:t xml:space="preserve">(the attendee uses the Zava files; Exercise 1 will show little in a spare); meanwhile the attendee follows the </w:t>
+        <w:t xml:space="preserve"> (the attendee uses the Zava files; Exercise 1 will show little in a spare); meanwhile the attendee </w:t>
+      </w:r>
+      <w:r>
+        <w:t xml:space="preserve">follows the </w:t>
       </w:r>
       <w:r>
         <w:rPr>
@@ -3020,10 +3044,7 @@
         <w:t>Whole room blocked</w:t>
       </w:r>
       <w:r>
-        <w:t xml:space="preserve"> </w:t>
-      </w:r>
-      <w:r>
-        <w:t xml:space="preserve">(Cowork or tenant down)? Switch to </w:t>
+        <w:t xml:space="preserve"> (Cowork or tenant down)? Switch to </w:t>
       </w:r>
       <w:hyperlink w:anchor="X26afd18925ecd972192f69d7821188544492b05">
         <w:r>
@@ -3042,7 +3063,7 @@
         <w:pStyle w:val="Heading2"/>
       </w:pPr>
       <w:bookmarkStart w:id="16" w:name="X05d7d62746bec70b3198d1bb50c6b714cd7330c"/>
-      <w:bookmarkStart w:id="17" w:name="_Toc242253845"/>
+      <w:bookmarkStart w:id="17" w:name="_Toc242262375"/>
       <w:bookmarkEnd w:id="14"/>
       <w:r>
         <w:t>Quick reference: what each prerequisite unlocks</w:t>
@@ -3522,7 +3543,7 @@
   <w:abstractNum w:abstractNumId="0" w15:restartNumberingAfterBreak="0">
     <w:nsid w:val="0000A990"/>
     <w:multiLevelType w:val="multilevel"/>
-    <w:tmpl w:val="9F701796"/>
+    <w:tmpl w:val="DCE62070"/>
     <w:lvl w:ilvl="0">
       <w:numFmt w:val="bullet"/>
       <w:lvlText w:val=" "/>
@@ -3599,7 +3620,7 @@
   <w:abstractNum w:abstractNumId="1" w15:restartNumberingAfterBreak="0">
     <w:nsid w:val="0000A991"/>
     <w:multiLevelType w:val="multilevel"/>
-    <w:tmpl w:val="BF96680C"/>
+    <w:tmpl w:val="BB54067E"/>
     <w:lvl w:ilvl="0">
       <w:numFmt w:val="bullet"/>
       <w:lvlText w:val=""/>
@@ -3703,7 +3724,7 @@
   <w:abstractNum w:abstractNumId="2" w15:restartNumberingAfterBreak="0">
     <w:nsid w:val="0000A992"/>
     <w:multiLevelType w:val="multilevel"/>
-    <w:tmpl w:val="4888EDE8"/>
+    <w:tmpl w:val="4EEC3248"/>
     <w:lvl w:ilvl="0">
       <w:numFmt w:val="bullet"/>
       <w:lvlText w:val="☐"/>
@@ -3780,7 +3801,7 @@
   <w:abstractNum w:abstractNumId="3" w15:restartNumberingAfterBreak="0">
     <w:nsid w:val="00A99411"/>
     <w:multiLevelType w:val="multilevel"/>
-    <w:tmpl w:val="9D4038C2"/>
+    <w:tmpl w:val="58BC751C"/>
     <w:lvl w:ilvl="0">
       <w:start w:val="1"/>
       <w:numFmt w:val="decimal"/>
@@ -3863,13 +3884,13 @@
       </w:pPr>
     </w:lvl>
   </w:abstractNum>
-  <w:num w:numId="1" w16cid:durableId="619996284">
+  <w:num w:numId="1" w16cid:durableId="1932815">
     <w:abstractNumId w:val="0"/>
   </w:num>
-  <w:num w:numId="2" w16cid:durableId="2045061016">
+  <w:num w:numId="2" w16cid:durableId="1537307788">
     <w:abstractNumId w:val="1"/>
   </w:num>
-  <w:num w:numId="3" w16cid:durableId="749347023">
+  <w:num w:numId="3" w16cid:durableId="2083140032">
     <w:abstractNumId w:val="3"/>
     <w:lvlOverride w:ilvl="0">
       <w:startOverride w:val="1"/>
@@ -3899,61 +3920,61 @@
       <w:startOverride w:val="1"/>
     </w:lvlOverride>
   </w:num>
-  <w:num w:numId="4" w16cid:durableId="529613540">
+  <w:num w:numId="4" w16cid:durableId="229538559">
     <w:abstractNumId w:val="2"/>
   </w:num>
-  <w:num w:numId="5" w16cid:durableId="354549791">
+  <w:num w:numId="5" w16cid:durableId="756436677">
     <w:abstractNumId w:val="2"/>
   </w:num>
-  <w:num w:numId="6" w16cid:durableId="975644629">
+  <w:num w:numId="6" w16cid:durableId="1370377602">
     <w:abstractNumId w:val="2"/>
   </w:num>
-  <w:num w:numId="7" w16cid:durableId="59910632">
+  <w:num w:numId="7" w16cid:durableId="1679574487">
     <w:abstractNumId w:val="2"/>
   </w:num>
-  <w:num w:numId="8" w16cid:durableId="1335842414">
+  <w:num w:numId="8" w16cid:durableId="1866481142">
     <w:abstractNumId w:val="2"/>
   </w:num>
-  <w:num w:numId="9" w16cid:durableId="1014458973">
+  <w:num w:numId="9" w16cid:durableId="1638219114">
     <w:abstractNumId w:val="2"/>
   </w:num>
-  <w:num w:numId="10" w16cid:durableId="2011715813">
+  <w:num w:numId="10" w16cid:durableId="1241449756">
     <w:abstractNumId w:val="2"/>
   </w:num>
-  <w:num w:numId="11" w16cid:durableId="1015690597">
+  <w:num w:numId="11" w16cid:durableId="38824735">
     <w:abstractNumId w:val="2"/>
   </w:num>
-  <w:num w:numId="12" w16cid:durableId="952631920">
+  <w:num w:numId="12" w16cid:durableId="806357993">
     <w:abstractNumId w:val="2"/>
   </w:num>
-  <w:num w:numId="13" w16cid:durableId="281306568">
+  <w:num w:numId="13" w16cid:durableId="1660114309">
     <w:abstractNumId w:val="2"/>
   </w:num>
-  <w:num w:numId="14" w16cid:durableId="656691952">
+  <w:num w:numId="14" w16cid:durableId="2047412065">
     <w:abstractNumId w:val="2"/>
   </w:num>
-  <w:num w:numId="15" w16cid:durableId="2101293212">
+  <w:num w:numId="15" w16cid:durableId="970744753">
     <w:abstractNumId w:val="2"/>
   </w:num>
-  <w:num w:numId="16" w16cid:durableId="1379816861">
+  <w:num w:numId="16" w16cid:durableId="2126944">
     <w:abstractNumId w:val="2"/>
   </w:num>
-  <w:num w:numId="17" w16cid:durableId="1267620304">
+  <w:num w:numId="17" w16cid:durableId="629824337">
     <w:abstractNumId w:val="2"/>
   </w:num>
-  <w:num w:numId="18" w16cid:durableId="1526406520">
+  <w:num w:numId="18" w16cid:durableId="1022822502">
     <w:abstractNumId w:val="2"/>
   </w:num>
-  <w:num w:numId="19" w16cid:durableId="1776055767">
+  <w:num w:numId="19" w16cid:durableId="2147161478">
     <w:abstractNumId w:val="2"/>
   </w:num>
-  <w:num w:numId="20" w16cid:durableId="1912350589">
+  <w:num w:numId="20" w16cid:durableId="1999460517">
     <w:abstractNumId w:val="2"/>
   </w:num>
-  <w:num w:numId="21" w16cid:durableId="1314063723">
+  <w:num w:numId="21" w16cid:durableId="1511213189">
     <w:abstractNumId w:val="1"/>
   </w:num>
-  <w:num w:numId="22" w16cid:durableId="1747846932">
+  <w:num w:numId="22" w16cid:durableId="1907765644">
     <w:abstractNumId w:val="1"/>
   </w:num>
 </w:numbering>
@@ -5232,7 +5253,7 @@
     <w:next w:val="Normal"/>
     <w:autoRedefine/>
     <w:uiPriority w:val="39"/>
-    <w:rsid w:val="00E52ACE"/>
+    <w:rsid w:val="00D05D2E"/>
     <w:pPr>
       <w:spacing w:after="100"/>
     </w:pPr>
@@ -5243,7 +5264,7 @@
     <w:next w:val="Normal"/>
     <w:autoRedefine/>
     <w:uiPriority w:val="39"/>
-    <w:rsid w:val="00E52ACE"/>
+    <w:rsid w:val="00D05D2E"/>
     <w:pPr>
       <w:spacing w:after="100"/>
       <w:ind w:left="210"/>
@@ -5253,7 +5274,7 @@
     <w:name w:val="header"/>
     <w:basedOn w:val="Normal"/>
     <w:link w:val="HeaderChar"/>
-    <w:rsid w:val="00E52ACE"/>
+    <w:rsid w:val="00D05D2E"/>
     <w:pPr>
       <w:tabs>
         <w:tab w:val="center" w:pos="4513"/>
@@ -5266,7 +5287,7 @@
     <w:name w:val="Header Char"/>
     <w:basedOn w:val="DefaultParagraphFont"/>
     <w:link w:val="Header"/>
-    <w:rsid w:val="00E52ACE"/>
+    <w:rsid w:val="00D05D2E"/>
     <w:rPr>
       <w:rFonts w:ascii="Segoe UI" w:eastAsia="Segoe UI" w:hAnsi="Segoe UI" w:cs="Segoe UI"/>
       <w:color w:val="242424"/>
@@ -5277,7 +5298,7 @@
     <w:name w:val="footer"/>
     <w:basedOn w:val="Normal"/>
     <w:link w:val="FooterChar"/>
-    <w:rsid w:val="00E52ACE"/>
+    <w:rsid w:val="00D05D2E"/>
     <w:pPr>
       <w:tabs>
         <w:tab w:val="center" w:pos="4513"/>
@@ -5290,7 +5311,7 @@
     <w:name w:val="Footer Char"/>
     <w:basedOn w:val="DefaultParagraphFont"/>
     <w:link w:val="Footer"/>
-    <w:rsid w:val="00E52ACE"/>
+    <w:rsid w:val="00D05D2E"/>
     <w:rPr>
       <w:rFonts w:ascii="Segoe UI" w:eastAsia="Segoe UI" w:hAnsi="Segoe UI" w:cs="Segoe UI"/>
       <w:color w:val="242424"/>

</xml_diff>